<commit_message>
Roteiro Gaspar x Soraya: ajustes de precisão (CPP 156, decisão do Gilmar, imunidade, Súmula 301)
Co-Authored-By: Claude Opus 5.5 <noreply@anthropic.com>
Claude-Session: https://claude.ai/code/session_01EGrxw11y1RieUGZ6R9XQan
</commit_message>
<xml_diff>
--- a/roteiros/curtos/ROTEIRO_GASPAR_11102026.docx
+++ b/roteiros/curtos/ROTEIRO_GASPAR_11102026.docx
@@ -101,7 +101,7 @@
           <w:sz w:val="24"/>
           <w:szCs w:val="24"/>
         </w:rPr>
-        <w:t xml:space="preserve">Aí vem o "não temos o dever de provar". Ela se apoiou numa súmula do STJ, a 301, que diz o seguinte: se o suposto pai se recusa a fazer o DNA, presume-se que ele é o pai.</w:t>
+        <w:t xml:space="preserve">Aí vem o "não temos o dever de provar". Ela se apoiou numa súmula do STJ, a 301, que diz o seguinte: se o suposto pai se recusa a fazer o DNA, presume-se, até prova em contrário, que ele é o pai.</w:t>
       </w:r>
     </w:p>
     <w:p>
@@ -129,7 +129,7 @@
           <w:sz w:val="24"/>
           <w:szCs w:val="24"/>
         </w:rPr>
-        <w:t xml:space="preserve">E quando a acusação é de crime, a regra é outra. O artigo 156 do Código de Processo Penal diz, com todas as letras: a prova da alegação cabe a quem a fizer. Quem acusa é que tem que provar. E a Constituição, no artigo 5º, garante que ninguém é considerado culpado antes de uma condenação definitiva.</w:t>
+        <w:t xml:space="preserve">E quando a acusação é de crime, a regra é outra. O artigo 156 do Código de Processo Penal diz, com todas as letras: a prova da alegação cabe a quem a fizer. No processo penal, quem acusa é que tem que provar a culpa; o acusado não tem que provar que é inocente. E a Constituição, no artigo 5º, garante que ninguém é considerado culpado antes de uma condenação definitiva.</w:t>
       </w:r>
     </w:p>
     <w:p>
@@ -157,21 +157,21 @@
           <w:sz w:val="24"/>
           <w:szCs w:val="24"/>
         </w:rPr>
-        <w:t xml:space="preserve">Resultado? A Procuradoria-Geral da República disse que não havia indício concreto contra o deputado. E o Gilmar escreveu na decisão que os prints, os áudios e os relatos não se confirmavam entre si e não tinham nenhuma prova independente por trás. Arquivou. Não tinha base nem pra abrir inquérito.</w:t>
-      </w:r>
-    </w:p>
-    <w:p>
-      <w:pPr>
-        <w:spacing w:after="160" w:line="300"/>
-        <w:jc w:val="both"/>
-      </w:pPr>
-      <w:r>
-        <w:rPr>
-          <w:rFonts w:ascii="Times New Roman" w:cs="Times New Roman" w:eastAsia="Times New Roman" w:hAnsi="Times New Roman"/>
-          <w:sz w:val="24"/>
-          <w:szCs w:val="24"/>
-        </w:rPr>
-        <w:t xml:space="preserve">Agora a parte cível. A Soraya se defendeu dizendo que tem imunidade parlamentar. E a defesa dela chegou a escrever no processo que a denúncia de um parlamentar "não necessita vir acompanhada de provas". O artigo 53 da Constituição realmente protege o parlamentar pelas opiniões, palavras e votos. Mas o próprio STF já decidiu várias vezes que, fora do plenário, essa proteção só vale pro que tem ligação com o mandato. Imunidade não é licença pra acusar alguém de estupro sem prova.</w:t>
+        <w:t xml:space="preserve">Resultado? A Procuradoria-Geral da República disse que não havia indício concreto contra o deputado. E o Gilmar escreveu na decisão que os prints, os áudios e os relatos não se confirmavam entre si e não tinham prova independente capaz de sustentar a acusação. Arquivou. Não tinha base nem pra abrir inquérito.</w:t>
+      </w:r>
+    </w:p>
+    <w:p>
+      <w:pPr>
+        <w:spacing w:after="160" w:line="300"/>
+        <w:jc w:val="both"/>
+      </w:pPr>
+      <w:r>
+        <w:rPr>
+          <w:rFonts w:ascii="Times New Roman" w:cs="Times New Roman" w:eastAsia="Times New Roman" w:hAnsi="Times New Roman"/>
+          <w:sz w:val="24"/>
+          <w:szCs w:val="24"/>
+        </w:rPr>
+        <w:t xml:space="preserve">Agora a parte cível. A Soraya se defendeu dizendo que tem imunidade parlamentar. E a defesa dela chegou a escrever no processo que a denúncia de um parlamentar "não necessita vir acompanhada de provas". O artigo 53 da Constituição realmente protege o parlamentar pelas opiniões, palavras e votos. Mas o próprio STF já decidiu várias vezes que a imunidade não protege automaticamente qualquer declaração de deputado ou senador. Fora do recinto do Parlamento, tem que ter ligação com o exercício do mandato. Imunidade não é licença pra acusar alguém de estupro sem prova.</w:t>
       </w:r>
     </w:p>
     <w:p>
@@ -411,7 +411,7 @@
           <w:sz w:val="21"/>
           <w:szCs w:val="21"/>
         </w:rPr>
-        <w:t xml:space="preserve"> frase "não temos o dever de provar absolutamente nada" citada na réplica (fls. 98-99) como post da Soraya, não impugnado; pedido de DNA feito pelo próprio Gaspar (fls. 22-35), deferido (fls. 39-44), coleta em 23/4 e laudo (fls. 61-66: perfil único e completo, 23 loci, "apto para fins de exames comparativos"); contestação do Senado invoca o art. 53 e diz que "a denúncia pública feita por um parlamentar não necessita vir acompanhada de provas ou de testemunhas" (fl. 75); sentença (fls. 132-146) afasta a imunidade, usa a decisão do Gilmar e condena com base no art. 5º, X, da CF e nos arts. 186, 187 e 927 do CC. A fala foi em coletiva nos corredores do Congresso (a defesa diz "entrevista concedida no Senado"); o juiz considerou fora do recinto parlamentar. Se comentarem "foi dentro do Senado": "imunidade absoluta é no plenário; fora dele, o STF exige ligação com o mandato, e o juiz entendeu que acusar alguém de estupro sem prova não tem".</w:t>
+        <w:t xml:space="preserve"> frase "não temos o dever de provar absolutamente nada" citada na réplica (fls. 98-99) como post da Soraya, não impugnado; pedido de DNA feito pelo próprio Gaspar (fls. 22-35), deferido (fls. 39-44), coleta em 23/4 e laudo (fls. 61-66: perfil único e completo, 23 loci, "apto para fins de exames comparativos"); contestação do Senado invoca o art. 53 e diz que "a denúncia pública feita por um parlamentar não necessita vir acompanhada de provas ou de testemunhas" (fl. 75); sentença (fls. 132-146) afasta a imunidade, usa a decisão do Gilmar e condena com base no art. 5º, X, da CF e nos arts. 186, 187 e 927 do CC. A fala foi em coletiva nos corredores do Congresso (a defesa diz "entrevista concedida no Senado"); o juiz considerou fora do recinto parlamentar. Se comentarem "foi dentro do Senado": "imunidade absoluta é no recinto do Parlamento; fora dele, o STF exige ligação com o mandato, e o juiz entendeu que acusar alguém de estupro sem prova não tem".</w:t>
       </w:r>
     </w:p>
     <w:p>

</xml_diff>